<commit_message>
Shorten games: full = 15 rounds (Short 8 / Medium 12 / Long 15)
Rescale every game length down so the full career is 15 rounds:
- Solo TOTAL_YEARS 25 → 15.
- Multiplayer modes Short 10/Medium 18/Long 25 → 8/12/15, across the
  frontend (gameModes.js) and backend (mp_createGame mode→years map,
  mp_resolveYear + mp_submitFinalScore defaults, and the score-bucketing
  thresholds in mp_submitFinalScore / modeForRounds).
- Update defaults in YearProgressBar and GoalLine to 15, and fix the
  progress-bar gate markers (were years 5/12 — stale) to the real career
  deadlines of year 3 (first article) and year 6 (first book).
- Refresh the in-game Actions guide and the how-to-play / assignment
  handouts to the new lengths.

No DB migration — total_years is set per game at creation; existing
scores keep their stored game_mode.

Co-Authored-By: Claude Opus 4.8 <noreply@anthropic.com>
</commit_message>
<xml_diff>
--- a/docs/The-Historians-How-To-Play.docx
+++ b/docs/The-Historians-How-To-Play.docx
@@ -388,7 +388,7 @@
         <w:spacing w:after="120" w:line="276"/>
       </w:pPr>
       <w:r>
-        <w:t xml:space="preserve">A solo career runs 25 years. Time only passes when you take one of these actions:</w:t>
+        <w:t xml:space="preserve">A solo career runs 15 years. Time only passes when you take one of these actions:</w:t>
       </w:r>
     </w:p>
     <w:p>
@@ -1329,7 +1329,7 @@
         <w:spacing w:after="120" w:line="276"/>
       </w:pPr>
       <w:r>
-        <w:t xml:space="preserve">2 to 5 historians share one archive and compete. From the home screen you can create a game (pick a deck and a length — Short 10 years, Medium 18, or Long 25) or join an open lobby. The host starts the game once everyone is in.</w:t>
+        <w:t xml:space="preserve">2 to 5 historians share one archive and compete. From the home screen you can create a game (pick a deck and a length — Short 8 years, Medium 12, or Long 15) or join an open lobby. The host starts the game once everyone is in.</w:t>
       </w:r>
     </w:p>
     <w:p>

</xml_diff>